<commit_message>
LEAD W11: verifikasi W10, koreksi cakupan 53 path di 25 dokumen, Master List dibangun ulang
Co-Authored-By: Claude Opus 5.5 <noreply@anthropic.com>
Claude-Session: https://claude.ai/code/session_0159PhF1EfdAQgraQwR2djAZ
</commit_message>
<xml_diff>
--- a/out/02_HR/SNX-HR-SOP-13 Mutation (Rev00 DRAFT).docx
+++ b/out/02_HR/SNX-HR-SOP-13 Mutation (Rev00 DRAFT).docx
@@ -2580,7 +2580,7 @@
           <w:sz w:val="24"/>
           <w:szCs w:val="24"/>
         </w:rPr>
-        <w:t xml:space="preserve">Dikecualikan dari SOP ini: kenaikan jabatan (SNX-HR-SOP-10), penurunan jabatan (SNX-HR-SOP-11), dan rotasi menurut batas di bawah (SNX-HR-SOP-12). Juga dikecualikan: perpindahan sementara di luar batas rotasi; pemindahan atas permintaan karyawan dan pemindahan sebagai sanksi disiplin; penetapan gaji, tunjangan, dan biaya yang timbul karena mutasi; serta mutasi Direktur Utama (JA-01), karena menurut SNX-HR-JA-01 atasan jabatan itu adalah organ perusahaan sesuai anggaran dasar (USULAN).</w:t>
+        <w:t xml:space="preserve">Dikecualikan dari SOP ini: kenaikan jabatan (SNX-HR-SOP-10), penurunan jabatan (SNX-HR-SOP-11), dan rotasi menurut batas di bawah (SNX-HR-SOP-12). Juga dikecualikan: perpindahan sementara di luar batas rotasi (USULAN); pemindahan atas permintaan karyawan dan pemindahan sebagai sanksi disiplin (USULAN); penetapan gaji, tunjangan, dan biaya yang timbul karena mutasi (USULAN); serta mutasi Direktur Utama (JA-01), karena menurut SNX-HR-JA-01 atasan jabatan itu adalah organ perusahaan sesuai anggaran dasar (USULAN).</w:t>
       </w:r>
     </w:p>
     <w:p>
@@ -3803,7 +3803,7 @@
           <w:sz w:val="24"/>
           <w:szCs w:val="24"/>
         </w:rPr>
-        <w:t xml:space="preserve">4.1 Dasar mutasi (ISO 9001:2015 7.1.2): Atasan Langsung Tujuan mengusulkan mutasi hanya jika ada kebutuhan organisasi, dan menuliskan kebutuhan itu di usulan mutasi (USULAN).</w:t>
+        <w:t xml:space="preserve">4.1 Dasar mutasi (ISO 9001:2015 7.1.2): Atasan Langsung Tujuan mengusulkan mutasi hanya karena kebutuhan organisasi, dan menuliskan kebutuhan itu di usulan mutasi (butir 6.1) (USULAN).</w:t>
       </w:r>
     </w:p>
     <w:p>

</xml_diff>